<commit_message>
Organise repository: presentations, report, database, app, docs
- Move review decks into presentations/
- Remove zip archive and report build tooling
- Keep cropped screenshots only; add ER and schema diagrams
- Add Streamlit theme config, .gitignore and video link page
- Update report and README with the DBMS_PBL repository link

Co-Authored-By: Claude Opus 5.5 <noreply@anthropic.com>
Claude-Session: https://claude.ai/code/session_01DUKVeXtsU6JbipHCXa6Rcf
</commit_message>
<xml_diff>
--- a/report/25WU0102069_Devyani_Pawar_DBMS_PBL_Report.docx
+++ b/report/25WU0102069_Devyani_Pawar_DBMS_PBL_Report.docx
@@ -34850,7 +34850,7 @@
                 <w:b w:val="0"/>
                 <w:sz w:val="21"/>
               </w:rPr>
-              <w:t>Linux (Arch Linux) / Windows; runs locally at http://localhost:8501</w:t>
+              <w:t>macOS / Linux / Windows; runs locally at http://localhost:8501</w:t>
             </w:r>
           </w:p>
         </w:tc>
@@ -34908,7 +34908,7 @@
                 <w:b w:val="0"/>
                 <w:sz w:val="21"/>
               </w:rPr>
-              <w:t>https://github.com/&lt;your-username&gt;/salon-spa-dbms</w:t>
+              <w:t>https://github.com/devyanipawar9003-max/DBMS_PBL</w:t>
             </w:r>
           </w:p>
         </w:tc>
@@ -42262,7 +42262,7 @@
           <w:i w:val="0"/>
           <w:sz w:val="24"/>
         </w:rPr>
-        <w:t>The complete script is submitted in the repository folder database/ (https://github.com/&lt;your-username&gt;/salon-spa-dbms). Run the single file salon_spa_full.sql, or the parts in order:</w:t>
+        <w:t>The complete script is submitted in the repository folder database/ (https://github.com/devyanipawar9003-max/DBMS_PBL). Run the single file salon_spa_full.sql, or the parts in order:</w:t>
       </w:r>
     </w:p>
     <w:p>
@@ -42396,7 +42396,7 @@
           <w:i w:val="0"/>
           <w:sz w:val="24"/>
         </w:rPr>
-        <w:t>Repository: https://github.com/&lt;your-username&gt;/salon-spa-dbms. The application is in the app/ folder: streamlit_app.py (entry point and navigation), db.py (connection, parameterised queries, transactions, error mapping), ui.py (validation and shared widgets) and views/ (one file per screen). Run: pip install -r requirements.txt, then streamlit run app/streamlit_app.py. The five-minute demonstration video link is in video/VIDEO_LINK.md.</w:t>
+        <w:t>Repository: https://github.com/devyanipawar9003-max/DBMS_PBL. The application is in the app/ folder: streamlit_app.py (entry point and navigation), db.py (connection, parameterised queries, transactions, error mapping), ui.py (validation and shared widgets) and views/ (one file per screen). Run: pip install -r requirements.txt, then streamlit run app/streamlit_app.py. The five-minute demonstration video link is in video/VIDEO_LINK.md.</w:t>
       </w:r>
     </w:p>
     <w:p>

</xml_diff>